<commit_message>
Add new scripts for generating and inspecting unit images, and implement a GUI for graph representation conversion
- Created laba6.py for adjacency and incidence matrix conversions with GUI.
- Added laba7_advanched.py for shortest path calculation in directed acyclic graphs (DAG) with GUI.
- Introduced generate_schematic.py and generate_unit_image.py for creating schematic and composite images.
- Implemented inspect_unit_positions.py to analyze unit positions in the generated images.
- Added several PNG resources for graphical representation.
</commit_message>
<xml_diff>
--- a/CURSOVA/OOP 2026 1Kurs/CURSOVA/Коваль_Олександр_Дмитрович_ROZDIL1 + VSTUPv2.docx
+++ b/CURSOVA/OOP 2026 1Kurs/CURSOVA/Коваль_Олександр_Дмитрович_ROZDIL1 + VSTUPv2.docx
@@ -1943,11 +1943,9 @@
       <w:r>
         <w:t xml:space="preserve">У першому розділі було проаналізовано предметну область проекту, що охоплює військову організацію Давнього </w:t>
       </w:r>
-      <w:proofErr w:type="spellStart"/>
-      <w:r>
-        <w:t>Riму</w:t>
-      </w:r>
-      <w:proofErr w:type="spellEnd"/>
+      <w:r>
+        <w:t>Риму</w:t>
+      </w:r>
       <w:r>
         <w:t xml:space="preserve"> з її ієрархічною структурою. Розглянуто мікрооб'єкти (воїни, центуріони, преторіанці) та макрооб'єкти (джерела руди, башти, бази). Комплексний аналіз існуючих реалізацій виявив їхні недоліки: високі системні вимоги та значну вартість. Порівняння мов програмування C++, C# та </w:t>
       </w:r>
@@ -1983,6 +1981,866 @@
       <w:r>
         <w:t>.</w:t>
       </w:r>
+    </w:p>
+    <w:p>
+      <w:pPr>
+        <w:spacing w:line="360" w:lineRule="auto"/>
+        <w:ind w:firstLine="720"/>
+        <w:jc w:val="both"/>
+      </w:pPr>
+    </w:p>
+    <w:p>
+      <w:pPr>
+        <w:spacing w:line="360" w:lineRule="auto"/>
+        <w:ind w:firstLine="720"/>
+        <w:jc w:val="both"/>
+      </w:pPr>
+    </w:p>
+    <w:p>
+      <w:pPr>
+        <w:spacing w:line="360" w:lineRule="auto"/>
+        <w:ind w:firstLine="720"/>
+        <w:jc w:val="both"/>
+      </w:pPr>
+    </w:p>
+    <w:p>
+      <w:pPr>
+        <w:spacing w:line="360" w:lineRule="auto"/>
+        <w:ind w:firstLine="720"/>
+        <w:jc w:val="both"/>
+      </w:pPr>
+    </w:p>
+    <w:p>
+      <w:pPr>
+        <w:spacing w:line="360" w:lineRule="auto"/>
+        <w:ind w:firstLine="720"/>
+        <w:jc w:val="both"/>
+      </w:pPr>
+    </w:p>
+    <w:p>
+      <w:pPr>
+        <w:spacing w:line="360" w:lineRule="auto"/>
+        <w:ind w:firstLine="720"/>
+        <w:jc w:val="both"/>
+      </w:pPr>
+    </w:p>
+    <w:p>
+      <w:pPr>
+        <w:spacing w:line="360" w:lineRule="auto"/>
+        <w:ind w:firstLine="720"/>
+        <w:jc w:val="both"/>
+      </w:pPr>
+    </w:p>
+    <w:p>
+      <w:pPr>
+        <w:spacing w:line="360" w:lineRule="auto"/>
+        <w:ind w:firstLine="720"/>
+        <w:jc w:val="both"/>
+      </w:pPr>
+    </w:p>
+    <w:p>
+      <w:pPr>
+        <w:spacing w:line="360" w:lineRule="auto"/>
+        <w:ind w:firstLine="720"/>
+        <w:jc w:val="both"/>
+      </w:pPr>
+    </w:p>
+    <w:p>
+      <w:pPr>
+        <w:spacing w:line="360" w:lineRule="auto"/>
+        <w:ind w:firstLine="720"/>
+        <w:jc w:val="both"/>
+      </w:pPr>
+    </w:p>
+    <w:p>
+      <w:pPr>
+        <w:spacing w:line="360" w:lineRule="auto"/>
+        <w:ind w:firstLine="720"/>
+        <w:jc w:val="both"/>
+      </w:pPr>
+    </w:p>
+    <w:p>
+      <w:pPr>
+        <w:spacing w:line="360" w:lineRule="auto"/>
+        <w:ind w:firstLine="720"/>
+        <w:jc w:val="both"/>
+      </w:pPr>
+    </w:p>
+    <w:p>
+      <w:pPr>
+        <w:spacing w:line="360" w:lineRule="auto"/>
+        <w:ind w:firstLine="720"/>
+        <w:jc w:val="both"/>
+      </w:pPr>
+    </w:p>
+    <w:p>
+      <w:pPr>
+        <w:pStyle w:val="1"/>
+        <w:spacing w:line="360" w:lineRule="auto"/>
+        <w:rPr>
+          <w:b w:val="0"/>
+          <w:bCs w:val="0"/>
+        </w:rPr>
+      </w:pPr>
+      <w:r>
+        <w:rPr>
+          <w:b w:val="0"/>
+          <w:bCs w:val="0"/>
+        </w:rPr>
+        <w:lastRenderedPageBreak/>
+        <w:t>2 РОЗРОБКА ПІДСИСТЕМИ ГРАФІЧНОГО ВІДОБРАЖЕННЯ</w:t>
+      </w:r>
+    </w:p>
+    <w:p>
+      <w:pPr>
+        <w:spacing w:line="360" w:lineRule="auto"/>
+        <w:ind w:firstLine="720"/>
+      </w:pPr>
+    </w:p>
+    <w:p>
+      <w:pPr>
+        <w:pStyle w:val="2"/>
+        <w:spacing w:line="360" w:lineRule="auto"/>
+        <w:ind w:left="709"/>
+        <w:rPr>
+          <w:b w:val="0"/>
+          <w:bCs w:val="0"/>
+          <w:lang w:val="en-US"/>
+        </w:rPr>
+      </w:pPr>
+      <w:r>
+        <w:rPr>
+          <w:b w:val="0"/>
+          <w:bCs w:val="0"/>
+        </w:rPr>
+        <w:t>2.2 Модель графічного відображення</w:t>
+      </w:r>
+    </w:p>
+    <w:p>
+      <w:pPr>
+        <w:spacing w:line="360" w:lineRule="auto"/>
+        <w:ind w:firstLine="709"/>
+      </w:pPr>
+      <w:r>
+        <w:t xml:space="preserve">Кожен мікрооб’єкт складається з власної </w:t>
+      </w:r>
+      <w:r>
+        <w:rPr>
+          <w:lang w:val="en-US"/>
+        </w:rPr>
+        <w:t>PNG</w:t>
+      </w:r>
+      <w:r>
+        <w:rPr>
+          <w:lang w:val="en-US"/>
+        </w:rPr>
+        <w:t>-</w:t>
+      </w:r>
+      <w:r>
+        <w:t>картинки, прямокутника, що відображає рівень очок здоров’я мікрооб’єкта, та назва мікрооб’єкта.</w:t>
+      </w:r>
+    </w:p>
+    <w:p>
+      <w:pPr>
+        <w:pStyle w:val="2"/>
+        <w:ind w:left="709"/>
+        <w:rPr>
+          <w:b w:val="0"/>
+          <w:bCs w:val="0"/>
+          <w:lang w:val="en-US"/>
+        </w:rPr>
+      </w:pPr>
+    </w:p>
+    <w:p>
+      <w:pPr>
+        <w:pStyle w:val="2"/>
+        <w:ind w:left="709"/>
+        <w:jc w:val="center"/>
+        <w:rPr>
+          <w:b w:val="0"/>
+          <w:bCs w:val="0"/>
+        </w:rPr>
+      </w:pPr>
+      <w:r>
+        <w:rPr>
+          <w:noProof/>
+        </w:rPr>
+        <w:drawing>
+          <wp:inline distT="0" distB="0" distL="0" distR="0" wp14:anchorId="71B66F23" wp14:editId="189CC99B">
+            <wp:extent cx="4396367" cy="3035935"/>
+            <wp:effectExtent l="0" t="0" r="4445" b="0"/>
+            <wp:docPr id="1452481662" name="Рисунок 2"/>
+            <wp:cNvGraphicFramePr>
+              <a:graphicFrameLocks xmlns:a="http://schemas.openxmlformats.org/drawingml/2006/main" noChangeAspect="1"/>
+            </wp:cNvGraphicFramePr>
+            <a:graphic xmlns:a="http://schemas.openxmlformats.org/drawingml/2006/main">
+              <a:graphicData uri="http://schemas.openxmlformats.org/drawingml/2006/picture">
+                <pic:pic xmlns:pic="http://schemas.openxmlformats.org/drawingml/2006/picture">
+                  <pic:nvPicPr>
+                    <pic:cNvPr id="0" name="Picture 6"/>
+                    <pic:cNvPicPr>
+                      <a:picLocks noChangeAspect="1" noChangeArrowheads="1"/>
+                    </pic:cNvPicPr>
+                  </pic:nvPicPr>
+                  <pic:blipFill>
+                    <a:blip r:embed="rId6">
+                      <a:extLst>
+                        <a:ext uri="{28A0092B-C50C-407E-A947-70E740481C1C}">
+                          <a14:useLocalDpi xmlns:a14="http://schemas.microsoft.com/office/drawing/2010/main" val="0"/>
+                        </a:ext>
+                      </a:extLst>
+                    </a:blip>
+                    <a:srcRect/>
+                    <a:stretch>
+                      <a:fillRect/>
+                    </a:stretch>
+                  </pic:blipFill>
+                  <pic:spPr bwMode="auto">
+                    <a:xfrm>
+                      <a:off x="0" y="0"/>
+                      <a:ext cx="4407797" cy="3043828"/>
+                    </a:xfrm>
+                    <a:prstGeom prst="rect">
+                      <a:avLst/>
+                    </a:prstGeom>
+                    <a:noFill/>
+                    <a:ln>
+                      <a:noFill/>
+                    </a:ln>
+                  </pic:spPr>
+                </pic:pic>
+              </a:graphicData>
+            </a:graphic>
+          </wp:inline>
+        </w:drawing>
+      </w:r>
+    </w:p>
+    <w:p>
+      <w:pPr>
+        <w:pStyle w:val="2"/>
+        <w:ind w:left="709"/>
+        <w:jc w:val="center"/>
+        <w:rPr>
+          <w:b w:val="0"/>
+          <w:bCs w:val="0"/>
+        </w:rPr>
+      </w:pPr>
+    </w:p>
+    <w:p>
+      <w:pPr>
+        <w:pStyle w:val="2"/>
+        <w:ind w:left="709"/>
+        <w:jc w:val="center"/>
+        <w:rPr>
+          <w:b w:val="0"/>
+          <w:bCs w:val="0"/>
+        </w:rPr>
+      </w:pPr>
+      <w:r>
+        <w:rPr>
+          <w:b w:val="0"/>
+          <w:bCs w:val="0"/>
+        </w:rPr>
+        <w:t>(пізніше додам інші мікрооб’єкти)</w:t>
+      </w:r>
+    </w:p>
+    <w:p>
+      <w:pPr>
+        <w:pStyle w:val="2"/>
+        <w:ind w:left="709"/>
+        <w:rPr>
+          <w:b w:val="0"/>
+          <w:bCs w:val="0"/>
+        </w:rPr>
+      </w:pPr>
+    </w:p>
+    <w:p>
+      <w:pPr>
+        <w:pStyle w:val="2"/>
+        <w:ind w:left="709"/>
+        <w:jc w:val="center"/>
+        <w:rPr>
+          <w:b w:val="0"/>
+          <w:bCs w:val="0"/>
+        </w:rPr>
+      </w:pPr>
+      <w:r>
+        <w:rPr>
+          <w:b w:val="0"/>
+          <w:bCs w:val="0"/>
+        </w:rPr>
+        <w:t>Рисунок 2.1 – Зображення мікрооб’єкта «Воїн»</w:t>
+      </w:r>
+    </w:p>
+    <w:p>
+      <w:pPr>
+        <w:pStyle w:val="2"/>
+        <w:ind w:left="709"/>
+        <w:jc w:val="center"/>
+        <w:rPr>
+          <w:b w:val="0"/>
+          <w:bCs w:val="0"/>
+        </w:rPr>
+      </w:pPr>
+    </w:p>
+    <w:p>
+      <w:pPr>
+        <w:spacing w:line="360" w:lineRule="auto"/>
+        <w:ind w:firstLine="709"/>
+      </w:pPr>
+      <w:r>
+        <w:t xml:space="preserve">Для вирахування мікрооб’єктів за основу було взято початкове положення зображення </w:t>
+      </w:r>
+      <w:r>
+        <w:rPr>
+          <w:lang w:val="en-US"/>
+        </w:rPr>
+        <w:t xml:space="preserve">X </w:t>
+      </w:r>
+      <w:r>
+        <w:t xml:space="preserve">та </w:t>
+      </w:r>
+      <w:r>
+        <w:rPr>
+          <w:lang w:val="en-US"/>
+        </w:rPr>
+        <w:t xml:space="preserve">Y </w:t>
+      </w:r>
+      <w:r>
+        <w:rPr>
+          <w:i/>
+          <w:iCs/>
+        </w:rPr>
+        <w:t>(див. рисунок 2.1)</w:t>
+      </w:r>
+      <w:r>
+        <w:rPr>
+          <w:i/>
+          <w:iCs/>
+        </w:rPr>
+        <w:t xml:space="preserve">, </w:t>
+      </w:r>
+      <w:r>
+        <w:t>які є приватними полями у батьківському класі мікрооб’єкта. Коефіцієнти були підібрані так, щоб було чітко видно кожен елемент мікрооб’єкта.</w:t>
+      </w:r>
+    </w:p>
+    <w:p>
+      <w:pPr>
+        <w:spacing w:line="360" w:lineRule="auto"/>
+        <w:ind w:firstLine="709"/>
+      </w:pPr>
+    </w:p>
+    <w:p>
+      <w:pPr>
+        <w:spacing w:line="360" w:lineRule="auto"/>
+        <w:ind w:firstLine="709"/>
+        <w:jc w:val="center"/>
+      </w:pPr>
+      <w:r>
+        <w:t>(опис макрооб’єктів та самі макрооб’єкти додам пізніше, як будуть реалізовані в програмі)</w:t>
+      </w:r>
+    </w:p>
+    <w:p>
+      <w:pPr>
+        <w:spacing w:line="360" w:lineRule="auto"/>
+        <w:ind w:firstLine="709"/>
+        <w:jc w:val="center"/>
+        <w:rPr>
+          <w:lang w:val="en-US"/>
+        </w:rPr>
+      </w:pPr>
+    </w:p>
+    <w:p>
+      <w:pPr>
+        <w:spacing w:line="360" w:lineRule="auto"/>
+        <w:ind w:firstLine="709"/>
+        <w:jc w:val="center"/>
+        <w:rPr>
+          <w:lang w:val="en-US"/>
+        </w:rPr>
+      </w:pPr>
+    </w:p>
+    <w:p>
+      <w:pPr>
+        <w:spacing w:line="360" w:lineRule="auto"/>
+        <w:ind w:firstLine="709"/>
+        <w:jc w:val="center"/>
+        <w:rPr>
+          <w:lang w:val="en-US"/>
+        </w:rPr>
+      </w:pPr>
+    </w:p>
+    <w:p>
+      <w:pPr>
+        <w:spacing w:line="360" w:lineRule="auto"/>
+        <w:ind w:firstLine="709"/>
+        <w:jc w:val="center"/>
+        <w:rPr>
+          <w:lang w:val="en-US"/>
+        </w:rPr>
+      </w:pPr>
+    </w:p>
+    <w:p>
+      <w:pPr>
+        <w:pStyle w:val="2"/>
+        <w:spacing w:line="360" w:lineRule="auto"/>
+        <w:ind w:firstLine="709"/>
+        <w:rPr>
+          <w:b w:val="0"/>
+        </w:rPr>
+      </w:pPr>
+      <w:bookmarkStart w:id="2" w:name="_Toc43411958"/>
+      <w:bookmarkStart w:id="3" w:name="_Toc43416216"/>
+      <w:r>
+        <w:rPr>
+          <w:b w:val="0"/>
+        </w:rPr>
+        <w:lastRenderedPageBreak/>
+        <w:t>2</w:t>
+      </w:r>
+      <w:r>
+        <w:rPr>
+          <w:b w:val="0"/>
+        </w:rPr>
+        <w:t>.3 Графічні процедури підсистеми графічного відображення</w:t>
+      </w:r>
+      <w:bookmarkEnd w:id="2"/>
+      <w:bookmarkEnd w:id="3"/>
+    </w:p>
+    <w:p>
+      <w:pPr>
+        <w:tabs>
+          <w:tab w:val="left" w:pos="0"/>
+        </w:tabs>
+        <w:spacing w:line="360" w:lineRule="auto"/>
+        <w:ind w:firstLine="720"/>
+      </w:pPr>
+      <w:r>
+        <w:t xml:space="preserve">Для створення зображень мікро- та макрооб’єктів у програмі було використано графічні засоби бібліотеки </w:t>
+      </w:r>
+      <w:r>
+        <w:rPr>
+          <w:lang w:val="en-US"/>
+        </w:rPr>
+        <w:t>JavaFX</w:t>
+      </w:r>
+      <w:r>
+        <w:t>. Основними використаними графічними примітивами були:</w:t>
+      </w:r>
+    </w:p>
+    <w:p>
+      <w:pPr>
+        <w:tabs>
+          <w:tab w:val="left" w:pos="0"/>
+        </w:tabs>
+        <w:spacing w:line="360" w:lineRule="auto"/>
+        <w:ind w:firstLine="720"/>
+      </w:pPr>
+      <w:proofErr w:type="spellStart"/>
+      <w:r>
+        <w:t>Group</w:t>
+      </w:r>
+      <w:proofErr w:type="spellEnd"/>
+      <w:r>
+        <w:t>(</w:t>
+      </w:r>
+      <w:r>
+        <w:rPr>
+          <w:lang w:val="en-US"/>
+        </w:rPr>
+        <w:t xml:space="preserve"> </w:t>
+      </w:r>
+      <w:r>
+        <w:t>)</w:t>
+      </w:r>
+      <w:r>
+        <w:rPr>
+          <w:lang w:val="en-US"/>
+        </w:rPr>
+        <w:t xml:space="preserve"> </w:t>
+      </w:r>
+      <w:r>
+        <w:t xml:space="preserve"> – </w:t>
+      </w:r>
+      <w:r>
+        <w:rPr>
+          <w:lang w:val="en-US"/>
+        </w:rPr>
+        <w:t xml:space="preserve"> </w:t>
+      </w:r>
+      <w:r>
+        <w:t xml:space="preserve">конструктор, що </w:t>
+      </w:r>
+      <w:r>
+        <w:t xml:space="preserve">створює групу, яка може містити у собі деяку кількість елементів класу </w:t>
+      </w:r>
+      <w:proofErr w:type="spellStart"/>
+      <w:r>
+        <w:t>Node</w:t>
+      </w:r>
+      <w:proofErr w:type="spellEnd"/>
+      <w:r>
+        <w:t xml:space="preserve"> для їх спільного розміщення на головний екран програми.</w:t>
+      </w:r>
+    </w:p>
+    <w:p>
+      <w:pPr>
+        <w:tabs>
+          <w:tab w:val="left" w:pos="0"/>
+        </w:tabs>
+        <w:spacing w:line="360" w:lineRule="auto"/>
+        <w:ind w:firstLine="720"/>
+      </w:pPr>
+      <w:proofErr w:type="spellStart"/>
+      <w:r>
+        <w:t>Scene</w:t>
+      </w:r>
+      <w:proofErr w:type="spellEnd"/>
+      <w:r>
+        <w:t>(</w:t>
+      </w:r>
+      <w:proofErr w:type="spellStart"/>
+      <w:r>
+        <w:t>Parent</w:t>
+      </w:r>
+      <w:proofErr w:type="spellEnd"/>
+      <w:r>
+        <w:t xml:space="preserve"> </w:t>
+      </w:r>
+      <w:proofErr w:type="spellStart"/>
+      <w:r>
+        <w:t>root</w:t>
+      </w:r>
+      <w:proofErr w:type="spellEnd"/>
+      <w:r>
+        <w:t xml:space="preserve">, </w:t>
+      </w:r>
+      <w:proofErr w:type="spellStart"/>
+      <w:r>
+        <w:t>double</w:t>
+      </w:r>
+      <w:proofErr w:type="spellEnd"/>
+      <w:r>
+        <w:t xml:space="preserve"> </w:t>
+      </w:r>
+      <w:proofErr w:type="spellStart"/>
+      <w:r>
+        <w:t>width</w:t>
+      </w:r>
+      <w:proofErr w:type="spellEnd"/>
+      <w:r>
+        <w:t xml:space="preserve">, </w:t>
+      </w:r>
+      <w:proofErr w:type="spellStart"/>
+      <w:r>
+        <w:t>double</w:t>
+      </w:r>
+      <w:proofErr w:type="spellEnd"/>
+      <w:r>
+        <w:t xml:space="preserve"> </w:t>
+      </w:r>
+      <w:proofErr w:type="spellStart"/>
+      <w:r>
+        <w:t>height</w:t>
+      </w:r>
+      <w:proofErr w:type="spellEnd"/>
+      <w:r>
+        <w:t>) </w:t>
+      </w:r>
+      <w:r>
+        <w:t xml:space="preserve"> </w:t>
+      </w:r>
+      <w:r>
+        <w:t xml:space="preserve">– </w:t>
+      </w:r>
+      <w:r>
+        <w:t xml:space="preserve"> </w:t>
+      </w:r>
+      <w:r>
+        <w:t xml:space="preserve">створює основну сцену розміром 1080×700 пікселів, яка містить </w:t>
+      </w:r>
+      <w:proofErr w:type="spellStart"/>
+      <w:r>
+        <w:t>Group</w:t>
+      </w:r>
+      <w:proofErr w:type="spellEnd"/>
+      <w:r>
+        <w:t xml:space="preserve"> з усіма графічними об'єктами. </w:t>
+      </w:r>
+    </w:p>
+    <w:p>
+      <w:pPr>
+        <w:tabs>
+          <w:tab w:val="left" w:pos="0"/>
+        </w:tabs>
+        <w:spacing w:line="360" w:lineRule="auto"/>
+        <w:ind w:firstLine="720"/>
+      </w:pPr>
+      <w:proofErr w:type="spellStart"/>
+      <w:r>
+        <w:t>Image</w:t>
+      </w:r>
+      <w:proofErr w:type="spellEnd"/>
+      <w:r>
+        <w:t>(</w:t>
+      </w:r>
+      <w:proofErr w:type="spellStart"/>
+      <w:r>
+        <w:t>String</w:t>
+      </w:r>
+      <w:proofErr w:type="spellEnd"/>
+      <w:r>
+        <w:t xml:space="preserve"> </w:t>
+      </w:r>
+      <w:proofErr w:type="spellStart"/>
+      <w:r>
+        <w:t>url</w:t>
+      </w:r>
+      <w:proofErr w:type="spellEnd"/>
+      <w:r>
+        <w:t>)</w:t>
+      </w:r>
+      <w:r>
+        <w:t xml:space="preserve"> </w:t>
+      </w:r>
+      <w:r>
+        <w:t> –</w:t>
+      </w:r>
+      <w:r>
+        <w:t xml:space="preserve"> </w:t>
+      </w:r>
+      <w:r>
+        <w:t xml:space="preserve"> завантажує картинку із переданого URL-посилання або шляху у пам'яті комп'ютера.</w:t>
+      </w:r>
+    </w:p>
+    <w:p>
+      <w:pPr>
+        <w:tabs>
+          <w:tab w:val="left" w:pos="0"/>
+        </w:tabs>
+        <w:spacing w:line="360" w:lineRule="auto"/>
+        <w:ind w:firstLine="720"/>
+      </w:pPr>
+      <w:proofErr w:type="spellStart"/>
+      <w:r>
+        <w:t>ImageView</w:t>
+      </w:r>
+      <w:proofErr w:type="spellEnd"/>
+      <w:r>
+        <w:t>(</w:t>
+      </w:r>
+      <w:proofErr w:type="spellStart"/>
+      <w:r>
+        <w:t>Image</w:t>
+      </w:r>
+      <w:proofErr w:type="spellEnd"/>
+      <w:r>
+        <w:t xml:space="preserve"> </w:t>
+      </w:r>
+      <w:proofErr w:type="spellStart"/>
+      <w:r>
+        <w:t>image</w:t>
+      </w:r>
+      <w:proofErr w:type="spellEnd"/>
+      <w:r>
+        <w:t>)</w:t>
+      </w:r>
+      <w:r>
+        <w:t xml:space="preserve"> </w:t>
+      </w:r>
+      <w:r>
+        <w:t> –</w:t>
+      </w:r>
+      <w:r>
+        <w:t xml:space="preserve"> </w:t>
+      </w:r>
+      <w:r>
+        <w:t xml:space="preserve"> конструктор елементу-картинки, який є наслідником класу </w:t>
+      </w:r>
+      <w:proofErr w:type="spellStart"/>
+      <w:r>
+        <w:t>Node</w:t>
+      </w:r>
+      <w:proofErr w:type="spellEnd"/>
+      <w:r>
+        <w:t>, що дозволяє розміщати його на екрані.</w:t>
+      </w:r>
+    </w:p>
+    <w:p>
+      <w:pPr>
+        <w:tabs>
+          <w:tab w:val="left" w:pos="0"/>
+        </w:tabs>
+        <w:spacing w:line="360" w:lineRule="auto"/>
+        <w:ind w:firstLine="720"/>
+      </w:pPr>
+      <w:proofErr w:type="spellStart"/>
+      <w:r>
+        <w:t>Label</w:t>
+      </w:r>
+      <w:proofErr w:type="spellEnd"/>
+      <w:r>
+        <w:t>(</w:t>
+      </w:r>
+      <w:proofErr w:type="spellStart"/>
+      <w:r>
+        <w:t>String</w:t>
+      </w:r>
+      <w:proofErr w:type="spellEnd"/>
+      <w:r>
+        <w:t xml:space="preserve"> </w:t>
+      </w:r>
+      <w:proofErr w:type="spellStart"/>
+      <w:r>
+        <w:t>text</w:t>
+      </w:r>
+      <w:proofErr w:type="spellEnd"/>
+      <w:r>
+        <w:t>) </w:t>
+      </w:r>
+      <w:r>
+        <w:t xml:space="preserve"> </w:t>
+      </w:r>
+      <w:r>
+        <w:t>–</w:t>
+      </w:r>
+      <w:r>
+        <w:t xml:space="preserve"> </w:t>
+      </w:r>
+      <w:r>
+        <w:t xml:space="preserve"> створює текстову мітку із заданим текстом</w:t>
+      </w:r>
+      <w:r>
+        <w:t>.</w:t>
+      </w:r>
+    </w:p>
+    <w:p>
+      <w:pPr>
+        <w:tabs>
+          <w:tab w:val="left" w:pos="0"/>
+        </w:tabs>
+        <w:spacing w:line="360" w:lineRule="auto"/>
+        <w:ind w:firstLine="720"/>
+      </w:pPr>
+      <w:proofErr w:type="spellStart"/>
+      <w:r>
+        <w:t>Line</w:t>
+      </w:r>
+      <w:proofErr w:type="spellEnd"/>
+      <w:r>
+        <w:t>()</w:t>
+      </w:r>
+      <w:r>
+        <w:t xml:space="preserve"> </w:t>
+      </w:r>
+      <w:r>
+        <w:t> –</w:t>
+      </w:r>
+      <w:r>
+        <w:t xml:space="preserve"> </w:t>
+      </w:r>
+      <w:r>
+        <w:t xml:space="preserve"> створює лінійний елемент для відображення </w:t>
+      </w:r>
+      <w:proofErr w:type="spellStart"/>
+      <w:r>
+        <w:t>полоски</w:t>
+      </w:r>
+      <w:proofErr w:type="spellEnd"/>
+      <w:r>
+        <w:t xml:space="preserve"> здоров'я</w:t>
+      </w:r>
+      <w:r>
+        <w:t>.</w:t>
+      </w:r>
+    </w:p>
+    <w:p>
+      <w:pPr>
+        <w:tabs>
+          <w:tab w:val="left" w:pos="0"/>
+        </w:tabs>
+        <w:spacing w:line="360" w:lineRule="auto"/>
+        <w:ind w:firstLine="720"/>
+      </w:pPr>
+      <w:proofErr w:type="spellStart"/>
+      <w:r>
+        <w:t>Rectangle</w:t>
+      </w:r>
+      <w:proofErr w:type="spellEnd"/>
+      <w:r>
+        <w:t>(</w:t>
+      </w:r>
+      <w:proofErr w:type="spellStart"/>
+      <w:r>
+        <w:t>double</w:t>
+      </w:r>
+      <w:proofErr w:type="spellEnd"/>
+      <w:r>
+        <w:t xml:space="preserve"> x, </w:t>
+      </w:r>
+      <w:proofErr w:type="spellStart"/>
+      <w:r>
+        <w:t>double</w:t>
+      </w:r>
+      <w:proofErr w:type="spellEnd"/>
+      <w:r>
+        <w:t xml:space="preserve"> y, </w:t>
+      </w:r>
+      <w:proofErr w:type="spellStart"/>
+      <w:r>
+        <w:t>double</w:t>
+      </w:r>
+      <w:proofErr w:type="spellEnd"/>
+      <w:r>
+        <w:t xml:space="preserve"> </w:t>
+      </w:r>
+      <w:proofErr w:type="spellStart"/>
+      <w:r>
+        <w:t>width</w:t>
+      </w:r>
+      <w:proofErr w:type="spellEnd"/>
+      <w:r>
+        <w:t xml:space="preserve">, </w:t>
+      </w:r>
+      <w:proofErr w:type="spellStart"/>
+      <w:r>
+        <w:t>double</w:t>
+      </w:r>
+      <w:proofErr w:type="spellEnd"/>
+      <w:r>
+        <w:t xml:space="preserve"> </w:t>
+      </w:r>
+      <w:proofErr w:type="spellStart"/>
+      <w:r>
+        <w:t>height</w:t>
+      </w:r>
+      <w:proofErr w:type="spellEnd"/>
+      <w:r>
+        <w:t>)</w:t>
+      </w:r>
+      <w:r>
+        <w:t xml:space="preserve"> </w:t>
+      </w:r>
+      <w:r>
+        <w:t xml:space="preserve"> – </w:t>
+      </w:r>
+      <w:r>
+        <w:t xml:space="preserve"> </w:t>
+      </w:r>
+      <w:r>
+        <w:t>створює прямокутник з координатами верхнього лівого кута (x, y), шириною та висотою.</w:t>
+      </w:r>
+    </w:p>
+    <w:p/>
+    <w:p>
+      <w:pPr>
+        <w:pStyle w:val="2"/>
+        <w:ind w:left="709"/>
+        <w:rPr>
+          <w:b w:val="0"/>
+          <w:bCs w:val="0"/>
+        </w:rPr>
+      </w:pPr>
     </w:p>
     <w:sectPr>
       <w:pgSz w:w="11906" w:h="16838"/>
@@ -2488,6 +3346,7 @@
   </w:style>
   <w:style w:type="paragraph" w:styleId="1">
     <w:name w:val="heading 1"/>
+    <w:link w:val="10"/>
     <w:uiPriority w:val="9"/>
     <w:qFormat/>
     <w:pPr>
@@ -2571,7 +3430,6 @@
   <w:style w:type="character" w:default="1" w:styleId="a0">
     <w:name w:val="Default Paragraph Font"/>
     <w:uiPriority w:val="1"/>
-    <w:semiHidden/>
     <w:unhideWhenUsed/>
   </w:style>
   <w:style w:type="table" w:default="1" w:styleId="a1">
@@ -2604,7 +3462,7 @@
       <w:szCs w:val="56"/>
     </w:rPr>
   </w:style>
-  <w:style w:type="paragraph" w:customStyle="1" w:styleId="10">
+  <w:style w:type="paragraph" w:customStyle="1" w:styleId="11">
     <w:name w:val="Строгий1"/>
     <w:qFormat/>
     <w:rPr>
@@ -2654,6 +3512,17 @@
     <w:rPr>
       <w:sz w:val="20"/>
       <w:szCs w:val="20"/>
+    </w:rPr>
+  </w:style>
+  <w:style w:type="character" w:customStyle="1" w:styleId="10">
+    <w:name w:val="Заголовок 1 Знак"/>
+    <w:basedOn w:val="a0"/>
+    <w:link w:val="1"/>
+    <w:uiPriority w:val="9"/>
+    <w:rsid w:val="00EC0871"/>
+    <w:rPr>
+      <w:b/>
+      <w:bCs/>
     </w:rPr>
   </w:style>
 </w:styles>

</xml_diff>